<commit_message>
Doi font bao cao sang Times New Roman, co chu 13
Co-Authored-By: Claude Sonnet 5 <noreply@anthropic.com>
Claude-Session: https://claude.ai/code/session_012BFFDvsVZNitqFgkwriAtr
</commit_message>
<xml_diff>
--- a/report/BaoCao_ThucNghiem_Sap_Xep.docx
+++ b/report/BaoCao_ThucNghiem_Sap_Xep.docx
@@ -5,90 +5,90 @@
     <w:p>
       <w:r>
         <w:rPr>
-          <w:rFonts w:ascii="Calibri" w:cs="Calibri" w:eastAsia="Calibri" w:hAnsi="Calibri"/>
-          <w:sz w:val="24"/>
-          <w:szCs w:val="24"/>
+          <w:rFonts w:ascii="Times New Roman" w:cs="Times New Roman" w:eastAsia="Times New Roman" w:hAnsi="Times New Roman"/>
+          <w:sz w:val="26"/>
+          <w:szCs w:val="26"/>
         </w:rPr>
         <w:t xml:space="preserve">Lớp: </w:t>
       </w:r>
       <w:r>
         <w:rPr>
-          <w:rFonts w:ascii="Calibri" w:cs="Calibri" w:eastAsia="Calibri" w:hAnsi="Calibri"/>
-          <w:b/>
-          <w:bCs/>
-          <w:sz w:val="24"/>
-          <w:szCs w:val="24"/>
-        </w:rPr>
-        <w:t xml:space="preserve">IT003.R17</w:t>
-      </w:r>
-    </w:p>
-    <w:p>
-      <w:pPr>
-        <w:spacing w:after="150" w:before="300"/>
-        <w:jc w:val="center"/>
-      </w:pPr>
-      <w:r>
-        <w:rPr>
-          <w:rFonts w:ascii="Calibri" w:cs="Calibri" w:eastAsia="Calibri" w:hAnsi="Calibri"/>
-          <w:b/>
-          <w:bCs/>
-          <w:sz w:val="36"/>
-          <w:szCs w:val="36"/>
-        </w:rPr>
-        <w:t xml:space="preserve">BÁO CÁO KẾT QUẢ THỬ NGHIỆM</w:t>
-      </w:r>
-    </w:p>
-    <w:p>
-      <w:r>
-        <w:rPr>
-          <w:rFonts w:ascii="Calibri" w:cs="Calibri" w:eastAsia="Calibri" w:hAnsi="Calibri"/>
-          <w:sz w:val="22"/>
-          <w:szCs w:val="22"/>
-        </w:rPr>
-        <w:t xml:space="preserve">Thời gian thực hiện: 01/10 – 10/10/2026</w:t>
-      </w:r>
-    </w:p>
-    <w:p>
-      <w:pPr>
-        <w:spacing w:before="200"/>
-      </w:pPr>
-      <w:r>
-        <w:rPr>
-          <w:rFonts w:ascii="Calibri" w:cs="Calibri" w:eastAsia="Calibri" w:hAnsi="Calibri"/>
-          <w:sz w:val="22"/>
-          <w:szCs w:val="22"/>
-        </w:rPr>
-        <w:t xml:space="preserve">Sinh viên thực hiện: Lê Hoàng Xuân Mai (MSSV: 25521070)</w:t>
-      </w:r>
-    </w:p>
-    <w:p>
-      <w:pPr>
-        <w:spacing w:after="200" w:before="300"/>
-      </w:pPr>
-      <w:r>
-        <w:rPr>
-          <w:rFonts w:ascii="Calibri" w:cs="Calibri" w:eastAsia="Calibri" w:hAnsi="Calibri"/>
-          <w:b/>
-          <w:bCs/>
-          <w:sz w:val="24"/>
-          <w:szCs w:val="24"/>
-        </w:rPr>
-        <w:t xml:space="preserve">Nội dung báo cáo:</w:t>
-      </w:r>
-    </w:p>
-    <w:p>
-      <w:pPr>
-        <w:pStyle w:val="Heading1"/>
-        <w:spacing w:after="150" w:before="300"/>
-      </w:pPr>
-      <w:r>
-        <w:rPr>
-          <w:rFonts w:ascii="Calibri" w:cs="Calibri" w:eastAsia="Calibri" w:hAnsi="Calibri"/>
+          <w:rFonts w:ascii="Times New Roman" w:cs="Times New Roman" w:eastAsia="Times New Roman" w:hAnsi="Times New Roman"/>
           <w:b/>
           <w:bCs/>
           <w:sz w:val="26"/>
           <w:szCs w:val="26"/>
         </w:rPr>
+        <w:t xml:space="preserve">IT003.R17</w:t>
+      </w:r>
+    </w:p>
+    <w:p>
+      <w:pPr>
+        <w:spacing w:after="150" w:before="300"/>
+        <w:jc w:val="center"/>
+      </w:pPr>
+      <w:r>
+        <w:rPr>
+          <w:rFonts w:ascii="Times New Roman" w:cs="Times New Roman" w:eastAsia="Times New Roman" w:hAnsi="Times New Roman"/>
+          <w:b/>
+          <w:bCs/>
+          <w:sz w:val="40"/>
+          <w:szCs w:val="40"/>
+        </w:rPr>
+        <w:t xml:space="preserve">BÁO CÁO KẾT QUẢ THỬ NGHIỆM</w:t>
+      </w:r>
+    </w:p>
+    <w:p>
+      <w:r>
+        <w:rPr>
+          <w:rFonts w:ascii="Times New Roman" w:cs="Times New Roman" w:eastAsia="Times New Roman" w:hAnsi="Times New Roman"/>
+          <w:sz w:val="26"/>
+          <w:szCs w:val="26"/>
+        </w:rPr>
+        <w:t xml:space="preserve">Thời gian thực hiện: 01/10 – 10/10/2026</w:t>
+      </w:r>
+    </w:p>
+    <w:p>
+      <w:pPr>
+        <w:spacing w:before="200"/>
+      </w:pPr>
+      <w:r>
+        <w:rPr>
+          <w:rFonts w:ascii="Times New Roman" w:cs="Times New Roman" w:eastAsia="Times New Roman" w:hAnsi="Times New Roman"/>
+          <w:sz w:val="26"/>
+          <w:szCs w:val="26"/>
+        </w:rPr>
+        <w:t xml:space="preserve">Sinh viên thực hiện: Lê Hoàng Xuân Mai (MSSV: 25521070)</w:t>
+      </w:r>
+    </w:p>
+    <w:p>
+      <w:pPr>
+        <w:spacing w:after="200" w:before="300"/>
+      </w:pPr>
+      <w:r>
+        <w:rPr>
+          <w:rFonts w:ascii="Times New Roman" w:cs="Times New Roman" w:eastAsia="Times New Roman" w:hAnsi="Times New Roman"/>
+          <w:b/>
+          <w:bCs/>
+          <w:sz w:val="26"/>
+          <w:szCs w:val="26"/>
+        </w:rPr>
+        <w:t xml:space="preserve">Nội dung báo cáo:</w:t>
+      </w:r>
+    </w:p>
+    <w:p>
+      <w:pPr>
+        <w:pStyle w:val="Heading1"/>
+        <w:spacing w:after="150" w:before="300"/>
+      </w:pPr>
+      <w:r>
+        <w:rPr>
+          <w:rFonts w:ascii="Times New Roman" w:cs="Times New Roman" w:eastAsia="Times New Roman" w:hAnsi="Times New Roman"/>
+          <w:b/>
+          <w:bCs/>
+          <w:sz w:val="28"/>
+          <w:szCs w:val="28"/>
+        </w:rPr>
         <w:t xml:space="preserve">I. Kết quả thử nghiệm</w:t>
       </w:r>
     </w:p>
@@ -98,13 +98,13 @@
       </w:pPr>
       <w:r>
         <w:rPr>
-          <w:rFonts w:ascii="Calibri" w:cs="Calibri" w:eastAsia="Calibri" w:hAnsi="Calibri"/>
+          <w:rFonts w:ascii="Times New Roman" w:cs="Times New Roman" w:eastAsia="Times New Roman" w:hAnsi="Times New Roman"/>
           <w:b/>
           <w:bCs/>
           <w:i/>
           <w:iCs/>
-          <w:sz w:val="23"/>
-          <w:szCs w:val="23"/>
+          <w:sz w:val="26"/>
+          <w:szCs w:val="26"/>
         </w:rPr>
         <w:t xml:space="preserve">1. Bảng thời gian thực hiện</w:t>
       </w:r>
@@ -151,11 +151,11 @@
             </w:pPr>
             <w:r>
               <w:rPr>
-                <w:rFonts w:ascii="Calibri" w:cs="Calibri" w:eastAsia="Calibri" w:hAnsi="Calibri"/>
+                <w:rFonts w:ascii="Times New Roman" w:cs="Times New Roman" w:eastAsia="Times New Roman" w:hAnsi="Times New Roman"/>
                 <w:b/>
                 <w:bCs/>
-                <w:sz w:val="21"/>
-                <w:szCs w:val="21"/>
+                <w:sz w:val="26"/>
+                <w:szCs w:val="26"/>
               </w:rPr>
               <w:t xml:space="preserve">Dữ liệu</w:t>
             </w:r>
@@ -180,11 +180,11 @@
             </w:pPr>
             <w:r>
               <w:rPr>
-                <w:rFonts w:ascii="Calibri" w:cs="Calibri" w:eastAsia="Calibri" w:hAnsi="Calibri"/>
+                <w:rFonts w:ascii="Times New Roman" w:cs="Times New Roman" w:eastAsia="Times New Roman" w:hAnsi="Times New Roman"/>
                 <w:b/>
                 <w:bCs/>
-                <w:sz w:val="21"/>
-                <w:szCs w:val="21"/>
+                <w:sz w:val="26"/>
+                <w:szCs w:val="26"/>
               </w:rPr>
               <w:t xml:space="preserve">Thời gian thực hiện (ms)</w:t>
             </w:r>
@@ -219,11 +219,11 @@
             </w:pPr>
             <w:r>
               <w:rPr>
-                <w:rFonts w:ascii="Calibri" w:cs="Calibri" w:eastAsia="Calibri" w:hAnsi="Calibri"/>
+                <w:rFonts w:ascii="Times New Roman" w:cs="Times New Roman" w:eastAsia="Times New Roman" w:hAnsi="Times New Roman"/>
                 <w:b/>
                 <w:bCs/>
-                <w:sz w:val="21"/>
-                <w:szCs w:val="21"/>
+                <w:sz w:val="26"/>
+                <w:szCs w:val="26"/>
               </w:rPr>
               <w:t xml:space="preserve">QuickSort</w:t>
             </w:r>
@@ -247,11 +247,11 @@
             </w:pPr>
             <w:r>
               <w:rPr>
-                <w:rFonts w:ascii="Calibri" w:cs="Calibri" w:eastAsia="Calibri" w:hAnsi="Calibri"/>
+                <w:rFonts w:ascii="Times New Roman" w:cs="Times New Roman" w:eastAsia="Times New Roman" w:hAnsi="Times New Roman"/>
                 <w:b/>
                 <w:bCs/>
-                <w:sz w:val="21"/>
-                <w:szCs w:val="21"/>
+                <w:sz w:val="26"/>
+                <w:szCs w:val="26"/>
               </w:rPr>
               <w:t xml:space="preserve">HeapSort</w:t>
             </w:r>
@@ -275,11 +275,11 @@
             </w:pPr>
             <w:r>
               <w:rPr>
-                <w:rFonts w:ascii="Calibri" w:cs="Calibri" w:eastAsia="Calibri" w:hAnsi="Calibri"/>
+                <w:rFonts w:ascii="Times New Roman" w:cs="Times New Roman" w:eastAsia="Times New Roman" w:hAnsi="Times New Roman"/>
                 <w:b/>
                 <w:bCs/>
-                <w:sz w:val="21"/>
-                <w:szCs w:val="21"/>
+                <w:sz w:val="26"/>
+                <w:szCs w:val="26"/>
               </w:rPr>
               <w:t xml:space="preserve">MergeSort</w:t>
             </w:r>
@@ -303,11 +303,11 @@
             </w:pPr>
             <w:r>
               <w:rPr>
-                <w:rFonts w:ascii="Calibri" w:cs="Calibri" w:eastAsia="Calibri" w:hAnsi="Calibri"/>
+                <w:rFonts w:ascii="Times New Roman" w:cs="Times New Roman" w:eastAsia="Times New Roman" w:hAnsi="Times New Roman"/>
                 <w:b/>
                 <w:bCs/>
-                <w:sz w:val="21"/>
-                <w:szCs w:val="21"/>
+                <w:sz w:val="26"/>
+                <w:szCs w:val="26"/>
               </w:rPr>
               <w:t xml:space="preserve">sort (C++)</w:t>
             </w:r>
@@ -332,11 +332,11 @@
             </w:pPr>
             <w:r>
               <w:rPr>
-                <w:rFonts w:ascii="Calibri" w:cs="Calibri" w:eastAsia="Calibri" w:hAnsi="Calibri"/>
-                <w:b w:val="false"/>
-                <w:bCs w:val="false"/>
-                <w:sz w:val="21"/>
-                <w:szCs w:val="21"/>
+                <w:rFonts w:ascii="Times New Roman" w:cs="Times New Roman" w:eastAsia="Times New Roman" w:hAnsi="Times New Roman"/>
+                <w:b w:val="false"/>
+                <w:bCs w:val="false"/>
+                <w:sz w:val="26"/>
+                <w:szCs w:val="26"/>
               </w:rPr>
               <w:t xml:space="preserve">1</w:t>
             </w:r>
@@ -359,11 +359,11 @@
             </w:pPr>
             <w:r>
               <w:rPr>
-                <w:rFonts w:ascii="Calibri" w:cs="Calibri" w:eastAsia="Calibri" w:hAnsi="Calibri"/>
-                <w:b w:val="false"/>
-                <w:bCs w:val="false"/>
-                <w:sz w:val="21"/>
-                <w:szCs w:val="21"/>
+                <w:rFonts w:ascii="Times New Roman" w:cs="Times New Roman" w:eastAsia="Times New Roman" w:hAnsi="Times New Roman"/>
+                <w:b w:val="false"/>
+                <w:bCs w:val="false"/>
+                <w:sz w:val="26"/>
+                <w:szCs w:val="26"/>
               </w:rPr>
               <w:t xml:space="preserve">36.44</w:t>
             </w:r>
@@ -386,11 +386,11 @@
             </w:pPr>
             <w:r>
               <w:rPr>
-                <w:rFonts w:ascii="Calibri" w:cs="Calibri" w:eastAsia="Calibri" w:hAnsi="Calibri"/>
-                <w:b w:val="false"/>
-                <w:bCs w:val="false"/>
-                <w:sz w:val="21"/>
-                <w:szCs w:val="21"/>
+                <w:rFonts w:ascii="Times New Roman" w:cs="Times New Roman" w:eastAsia="Times New Roman" w:hAnsi="Times New Roman"/>
+                <w:b w:val="false"/>
+                <w:bCs w:val="false"/>
+                <w:sz w:val="26"/>
+                <w:szCs w:val="26"/>
               </w:rPr>
               <w:t xml:space="preserve">66.06</w:t>
             </w:r>
@@ -413,11 +413,11 @@
             </w:pPr>
             <w:r>
               <w:rPr>
-                <w:rFonts w:ascii="Calibri" w:cs="Calibri" w:eastAsia="Calibri" w:hAnsi="Calibri"/>
-                <w:b w:val="false"/>
-                <w:bCs w:val="false"/>
-                <w:sz w:val="21"/>
-                <w:szCs w:val="21"/>
+                <w:rFonts w:ascii="Times New Roman" w:cs="Times New Roman" w:eastAsia="Times New Roman" w:hAnsi="Times New Roman"/>
+                <w:b w:val="false"/>
+                <w:bCs w:val="false"/>
+                <w:sz w:val="26"/>
+                <w:szCs w:val="26"/>
               </w:rPr>
               <w:t xml:space="preserve">41.70</w:t>
             </w:r>
@@ -440,11 +440,11 @@
             </w:pPr>
             <w:r>
               <w:rPr>
-                <w:rFonts w:ascii="Calibri" w:cs="Calibri" w:eastAsia="Calibri" w:hAnsi="Calibri"/>
-                <w:b w:val="false"/>
-                <w:bCs w:val="false"/>
-                <w:sz w:val="21"/>
-                <w:szCs w:val="21"/>
+                <w:rFonts w:ascii="Times New Roman" w:cs="Times New Roman" w:eastAsia="Times New Roman" w:hAnsi="Times New Roman"/>
+                <w:b w:val="false"/>
+                <w:bCs w:val="false"/>
+                <w:sz w:val="26"/>
+                <w:szCs w:val="26"/>
               </w:rPr>
               <w:t xml:space="preserve">13.35</w:t>
             </w:r>
@@ -469,11 +469,11 @@
             </w:pPr>
             <w:r>
               <w:rPr>
-                <w:rFonts w:ascii="Calibri" w:cs="Calibri" w:eastAsia="Calibri" w:hAnsi="Calibri"/>
-                <w:b w:val="false"/>
-                <w:bCs w:val="false"/>
-                <w:sz w:val="21"/>
-                <w:szCs w:val="21"/>
+                <w:rFonts w:ascii="Times New Roman" w:cs="Times New Roman" w:eastAsia="Times New Roman" w:hAnsi="Times New Roman"/>
+                <w:b w:val="false"/>
+                <w:bCs w:val="false"/>
+                <w:sz w:val="26"/>
+                <w:szCs w:val="26"/>
               </w:rPr>
               <w:t xml:space="preserve">2</w:t>
             </w:r>
@@ -496,11 +496,11 @@
             </w:pPr>
             <w:r>
               <w:rPr>
-                <w:rFonts w:ascii="Calibri" w:cs="Calibri" w:eastAsia="Calibri" w:hAnsi="Calibri"/>
-                <w:b w:val="false"/>
-                <w:bCs w:val="false"/>
-                <w:sz w:val="21"/>
-                <w:szCs w:val="21"/>
+                <w:rFonts w:ascii="Times New Roman" w:cs="Times New Roman" w:eastAsia="Times New Roman" w:hAnsi="Times New Roman"/>
+                <w:b w:val="false"/>
+                <w:bCs w:val="false"/>
+                <w:sz w:val="26"/>
+                <w:szCs w:val="26"/>
               </w:rPr>
               <w:t xml:space="preserve">41.75</w:t>
             </w:r>
@@ -523,11 +523,11 @@
             </w:pPr>
             <w:r>
               <w:rPr>
-                <w:rFonts w:ascii="Calibri" w:cs="Calibri" w:eastAsia="Calibri" w:hAnsi="Calibri"/>
-                <w:b w:val="false"/>
-                <w:bCs w:val="false"/>
-                <w:sz w:val="21"/>
-                <w:szCs w:val="21"/>
+                <w:rFonts w:ascii="Times New Roman" w:cs="Times New Roman" w:eastAsia="Times New Roman" w:hAnsi="Times New Roman"/>
+                <w:b w:val="false"/>
+                <w:bCs w:val="false"/>
+                <w:sz w:val="26"/>
+                <w:szCs w:val="26"/>
               </w:rPr>
               <w:t xml:space="preserve">67.59</w:t>
             </w:r>
@@ -550,11 +550,11 @@
             </w:pPr>
             <w:r>
               <w:rPr>
-                <w:rFonts w:ascii="Calibri" w:cs="Calibri" w:eastAsia="Calibri" w:hAnsi="Calibri"/>
-                <w:b w:val="false"/>
-                <w:bCs w:val="false"/>
-                <w:sz w:val="21"/>
-                <w:szCs w:val="21"/>
+                <w:rFonts w:ascii="Times New Roman" w:cs="Times New Roman" w:eastAsia="Times New Roman" w:hAnsi="Times New Roman"/>
+                <w:b w:val="false"/>
+                <w:bCs w:val="false"/>
+                <w:sz w:val="26"/>
+                <w:szCs w:val="26"/>
               </w:rPr>
               <w:t xml:space="preserve">33.48</w:t>
             </w:r>
@@ -577,11 +577,11 @@
             </w:pPr>
             <w:r>
               <w:rPr>
-                <w:rFonts w:ascii="Calibri" w:cs="Calibri" w:eastAsia="Calibri" w:hAnsi="Calibri"/>
-                <w:b w:val="false"/>
-                <w:bCs w:val="false"/>
-                <w:sz w:val="21"/>
-                <w:szCs w:val="21"/>
+                <w:rFonts w:ascii="Times New Roman" w:cs="Times New Roman" w:eastAsia="Times New Roman" w:hAnsi="Times New Roman"/>
+                <w:b w:val="false"/>
+                <w:bCs w:val="false"/>
+                <w:sz w:val="26"/>
+                <w:szCs w:val="26"/>
               </w:rPr>
               <w:t xml:space="preserve">8.20</w:t>
             </w:r>
@@ -606,11 +606,11 @@
             </w:pPr>
             <w:r>
               <w:rPr>
-                <w:rFonts w:ascii="Calibri" w:cs="Calibri" w:eastAsia="Calibri" w:hAnsi="Calibri"/>
-                <w:b w:val="false"/>
-                <w:bCs w:val="false"/>
-                <w:sz w:val="21"/>
-                <w:szCs w:val="21"/>
+                <w:rFonts w:ascii="Times New Roman" w:cs="Times New Roman" w:eastAsia="Times New Roman" w:hAnsi="Times New Roman"/>
+                <w:b w:val="false"/>
+                <w:bCs w:val="false"/>
+                <w:sz w:val="26"/>
+                <w:szCs w:val="26"/>
               </w:rPr>
               <w:t xml:space="preserve">3</w:t>
             </w:r>
@@ -633,11 +633,11 @@
             </w:pPr>
             <w:r>
               <w:rPr>
-                <w:rFonts w:ascii="Calibri" w:cs="Calibri" w:eastAsia="Calibri" w:hAnsi="Calibri"/>
-                <w:b w:val="false"/>
-                <w:bCs w:val="false"/>
-                <w:sz w:val="21"/>
-                <w:szCs w:val="21"/>
+                <w:rFonts w:ascii="Times New Roman" w:cs="Times New Roman" w:eastAsia="Times New Roman" w:hAnsi="Times New Roman"/>
+                <w:b w:val="false"/>
+                <w:bCs w:val="false"/>
+                <w:sz w:val="26"/>
+                <w:szCs w:val="26"/>
               </w:rPr>
               <w:t xml:space="preserve">103.12</w:t>
             </w:r>
@@ -660,11 +660,11 @@
             </w:pPr>
             <w:r>
               <w:rPr>
-                <w:rFonts w:ascii="Calibri" w:cs="Calibri" w:eastAsia="Calibri" w:hAnsi="Calibri"/>
-                <w:b w:val="false"/>
-                <w:bCs w:val="false"/>
-                <w:sz w:val="21"/>
-                <w:szCs w:val="21"/>
+                <w:rFonts w:ascii="Times New Roman" w:cs="Times New Roman" w:eastAsia="Times New Roman" w:hAnsi="Times New Roman"/>
+                <w:b w:val="false"/>
+                <w:bCs w:val="false"/>
+                <w:sz w:val="26"/>
+                <w:szCs w:val="26"/>
               </w:rPr>
               <w:t xml:space="preserve">146.34</w:t>
             </w:r>
@@ -687,11 +687,11 @@
             </w:pPr>
             <w:r>
               <w:rPr>
-                <w:rFonts w:ascii="Calibri" w:cs="Calibri" w:eastAsia="Calibri" w:hAnsi="Calibri"/>
-                <w:b w:val="false"/>
-                <w:bCs w:val="false"/>
-                <w:sz w:val="21"/>
-                <w:szCs w:val="21"/>
+                <w:rFonts w:ascii="Times New Roman" w:cs="Times New Roman" w:eastAsia="Times New Roman" w:hAnsi="Times New Roman"/>
+                <w:b w:val="false"/>
+                <w:bCs w:val="false"/>
+                <w:sz w:val="26"/>
+                <w:szCs w:val="26"/>
               </w:rPr>
               <w:t xml:space="preserve">128.74</w:t>
             </w:r>
@@ -714,11 +714,11 @@
             </w:pPr>
             <w:r>
               <w:rPr>
-                <w:rFonts w:ascii="Calibri" w:cs="Calibri" w:eastAsia="Calibri" w:hAnsi="Calibri"/>
-                <w:b w:val="false"/>
-                <w:bCs w:val="false"/>
-                <w:sz w:val="21"/>
-                <w:szCs w:val="21"/>
+                <w:rFonts w:ascii="Times New Roman" w:cs="Times New Roman" w:eastAsia="Times New Roman" w:hAnsi="Times New Roman"/>
+                <w:b w:val="false"/>
+                <w:bCs w:val="false"/>
+                <w:sz w:val="26"/>
+                <w:szCs w:val="26"/>
               </w:rPr>
               <w:t xml:space="preserve">85.22</w:t>
             </w:r>
@@ -743,11 +743,11 @@
             </w:pPr>
             <w:r>
               <w:rPr>
-                <w:rFonts w:ascii="Calibri" w:cs="Calibri" w:eastAsia="Calibri" w:hAnsi="Calibri"/>
-                <w:b w:val="false"/>
-                <w:bCs w:val="false"/>
-                <w:sz w:val="21"/>
-                <w:szCs w:val="21"/>
+                <w:rFonts w:ascii="Times New Roman" w:cs="Times New Roman" w:eastAsia="Times New Roman" w:hAnsi="Times New Roman"/>
+                <w:b w:val="false"/>
+                <w:bCs w:val="false"/>
+                <w:sz w:val="26"/>
+                <w:szCs w:val="26"/>
               </w:rPr>
               <w:t xml:space="preserve">4</w:t>
             </w:r>
@@ -770,11 +770,11 @@
             </w:pPr>
             <w:r>
               <w:rPr>
-                <w:rFonts w:ascii="Calibri" w:cs="Calibri" w:eastAsia="Calibri" w:hAnsi="Calibri"/>
-                <w:b w:val="false"/>
-                <w:bCs w:val="false"/>
-                <w:sz w:val="21"/>
-                <w:szCs w:val="21"/>
+                <w:rFonts w:ascii="Times New Roman" w:cs="Times New Roman" w:eastAsia="Times New Roman" w:hAnsi="Times New Roman"/>
+                <w:b w:val="false"/>
+                <w:bCs w:val="false"/>
+                <w:sz w:val="26"/>
+                <w:szCs w:val="26"/>
               </w:rPr>
               <w:t xml:space="preserve">118.97</w:t>
             </w:r>
@@ -797,11 +797,11 @@
             </w:pPr>
             <w:r>
               <w:rPr>
-                <w:rFonts w:ascii="Calibri" w:cs="Calibri" w:eastAsia="Calibri" w:hAnsi="Calibri"/>
-                <w:b w:val="false"/>
-                <w:bCs w:val="false"/>
-                <w:sz w:val="21"/>
-                <w:szCs w:val="21"/>
+                <w:rFonts w:ascii="Times New Roman" w:cs="Times New Roman" w:eastAsia="Times New Roman" w:hAnsi="Times New Roman"/>
+                <w:b w:val="false"/>
+                <w:bCs w:val="false"/>
+                <w:sz w:val="26"/>
+                <w:szCs w:val="26"/>
               </w:rPr>
               <w:t xml:space="preserve">176.78</w:t>
             </w:r>
@@ -824,11 +824,11 @@
             </w:pPr>
             <w:r>
               <w:rPr>
-                <w:rFonts w:ascii="Calibri" w:cs="Calibri" w:eastAsia="Calibri" w:hAnsi="Calibri"/>
-                <w:b w:val="false"/>
-                <w:bCs w:val="false"/>
-                <w:sz w:val="21"/>
-                <w:szCs w:val="21"/>
+                <w:rFonts w:ascii="Times New Roman" w:cs="Times New Roman" w:eastAsia="Times New Roman" w:hAnsi="Times New Roman"/>
+                <w:b w:val="false"/>
+                <w:bCs w:val="false"/>
+                <w:sz w:val="26"/>
+                <w:szCs w:val="26"/>
               </w:rPr>
               <w:t xml:space="preserve">133.87</w:t>
             </w:r>
@@ -851,11 +851,11 @@
             </w:pPr>
             <w:r>
               <w:rPr>
-                <w:rFonts w:ascii="Calibri" w:cs="Calibri" w:eastAsia="Calibri" w:hAnsi="Calibri"/>
-                <w:b w:val="false"/>
-                <w:bCs w:val="false"/>
-                <w:sz w:val="21"/>
-                <w:szCs w:val="21"/>
+                <w:rFonts w:ascii="Times New Roman" w:cs="Times New Roman" w:eastAsia="Times New Roman" w:hAnsi="Times New Roman"/>
+                <w:b w:val="false"/>
+                <w:bCs w:val="false"/>
+                <w:sz w:val="26"/>
+                <w:szCs w:val="26"/>
               </w:rPr>
               <w:t xml:space="preserve">85.23</w:t>
             </w:r>
@@ -880,11 +880,11 @@
             </w:pPr>
             <w:r>
               <w:rPr>
-                <w:rFonts w:ascii="Calibri" w:cs="Calibri" w:eastAsia="Calibri" w:hAnsi="Calibri"/>
-                <w:b w:val="false"/>
-                <w:bCs w:val="false"/>
-                <w:sz w:val="21"/>
-                <w:szCs w:val="21"/>
+                <w:rFonts w:ascii="Times New Roman" w:cs="Times New Roman" w:eastAsia="Times New Roman" w:hAnsi="Times New Roman"/>
+                <w:b w:val="false"/>
+                <w:bCs w:val="false"/>
+                <w:sz w:val="26"/>
+                <w:szCs w:val="26"/>
               </w:rPr>
               <w:t xml:space="preserve">5</w:t>
             </w:r>
@@ -907,11 +907,11 @@
             </w:pPr>
             <w:r>
               <w:rPr>
-                <w:rFonts w:ascii="Calibri" w:cs="Calibri" w:eastAsia="Calibri" w:hAnsi="Calibri"/>
-                <w:b w:val="false"/>
-                <w:bCs w:val="false"/>
-                <w:sz w:val="21"/>
-                <w:szCs w:val="21"/>
+                <w:rFonts w:ascii="Times New Roman" w:cs="Times New Roman" w:eastAsia="Times New Roman" w:hAnsi="Times New Roman"/>
+                <w:b w:val="false"/>
+                <w:bCs w:val="false"/>
+                <w:sz w:val="26"/>
+                <w:szCs w:val="26"/>
               </w:rPr>
               <w:t xml:space="preserve">106.15</w:t>
             </w:r>
@@ -934,11 +934,11 @@
             </w:pPr>
             <w:r>
               <w:rPr>
-                <w:rFonts w:ascii="Calibri" w:cs="Calibri" w:eastAsia="Calibri" w:hAnsi="Calibri"/>
-                <w:b w:val="false"/>
-                <w:bCs w:val="false"/>
-                <w:sz w:val="21"/>
-                <w:szCs w:val="21"/>
+                <w:rFonts w:ascii="Times New Roman" w:cs="Times New Roman" w:eastAsia="Times New Roman" w:hAnsi="Times New Roman"/>
+                <w:b w:val="false"/>
+                <w:bCs w:val="false"/>
+                <w:sz w:val="26"/>
+                <w:szCs w:val="26"/>
               </w:rPr>
               <w:t xml:space="preserve">150.56</w:t>
             </w:r>
@@ -961,11 +961,11 @@
             </w:pPr>
             <w:r>
               <w:rPr>
-                <w:rFonts w:ascii="Calibri" w:cs="Calibri" w:eastAsia="Calibri" w:hAnsi="Calibri"/>
-                <w:b w:val="false"/>
-                <w:bCs w:val="false"/>
-                <w:sz w:val="21"/>
-                <w:szCs w:val="21"/>
+                <w:rFonts w:ascii="Times New Roman" w:cs="Times New Roman" w:eastAsia="Times New Roman" w:hAnsi="Times New Roman"/>
+                <w:b w:val="false"/>
+                <w:bCs w:val="false"/>
+                <w:sz w:val="26"/>
+                <w:szCs w:val="26"/>
               </w:rPr>
               <w:t xml:space="preserve">125.67</w:t>
             </w:r>
@@ -988,11 +988,11 @@
             </w:pPr>
             <w:r>
               <w:rPr>
-                <w:rFonts w:ascii="Calibri" w:cs="Calibri" w:eastAsia="Calibri" w:hAnsi="Calibri"/>
-                <w:b w:val="false"/>
-                <w:bCs w:val="false"/>
-                <w:sz w:val="21"/>
-                <w:szCs w:val="21"/>
+                <w:rFonts w:ascii="Times New Roman" w:cs="Times New Roman" w:eastAsia="Times New Roman" w:hAnsi="Times New Roman"/>
+                <w:b w:val="false"/>
+                <w:bCs w:val="false"/>
+                <w:sz w:val="26"/>
+                <w:szCs w:val="26"/>
               </w:rPr>
               <w:t xml:space="preserve">84.71</w:t>
             </w:r>
@@ -1017,11 +1017,11 @@
             </w:pPr>
             <w:r>
               <w:rPr>
-                <w:rFonts w:ascii="Calibri" w:cs="Calibri" w:eastAsia="Calibri" w:hAnsi="Calibri"/>
-                <w:b w:val="false"/>
-                <w:bCs w:val="false"/>
-                <w:sz w:val="21"/>
-                <w:szCs w:val="21"/>
+                <w:rFonts w:ascii="Times New Roman" w:cs="Times New Roman" w:eastAsia="Times New Roman" w:hAnsi="Times New Roman"/>
+                <w:b w:val="false"/>
+                <w:bCs w:val="false"/>
+                <w:sz w:val="26"/>
+                <w:szCs w:val="26"/>
               </w:rPr>
               <w:t xml:space="preserve">6</w:t>
             </w:r>
@@ -1044,11 +1044,11 @@
             </w:pPr>
             <w:r>
               <w:rPr>
-                <w:rFonts w:ascii="Calibri" w:cs="Calibri" w:eastAsia="Calibri" w:hAnsi="Calibri"/>
-                <w:b w:val="false"/>
-                <w:bCs w:val="false"/>
-                <w:sz w:val="21"/>
-                <w:szCs w:val="21"/>
+                <w:rFonts w:ascii="Times New Roman" w:cs="Times New Roman" w:eastAsia="Times New Roman" w:hAnsi="Times New Roman"/>
+                <w:b w:val="false"/>
+                <w:bCs w:val="false"/>
+                <w:sz w:val="26"/>
+                <w:szCs w:val="26"/>
               </w:rPr>
               <w:t xml:space="preserve">98.43</w:t>
             </w:r>
@@ -1071,11 +1071,11 @@
             </w:pPr>
             <w:r>
               <w:rPr>
-                <w:rFonts w:ascii="Calibri" w:cs="Calibri" w:eastAsia="Calibri" w:hAnsi="Calibri"/>
-                <w:b w:val="false"/>
-                <w:bCs w:val="false"/>
-                <w:sz w:val="21"/>
-                <w:szCs w:val="21"/>
+                <w:rFonts w:ascii="Times New Roman" w:cs="Times New Roman" w:eastAsia="Times New Roman" w:hAnsi="Times New Roman"/>
+                <w:b w:val="false"/>
+                <w:bCs w:val="false"/>
+                <w:sz w:val="26"/>
+                <w:szCs w:val="26"/>
               </w:rPr>
               <w:t xml:space="preserve">138.97</w:t>
             </w:r>
@@ -1098,11 +1098,11 @@
             </w:pPr>
             <w:r>
               <w:rPr>
-                <w:rFonts w:ascii="Calibri" w:cs="Calibri" w:eastAsia="Calibri" w:hAnsi="Calibri"/>
-                <w:b w:val="false"/>
-                <w:bCs w:val="false"/>
-                <w:sz w:val="21"/>
-                <w:szCs w:val="21"/>
+                <w:rFonts w:ascii="Times New Roman" w:cs="Times New Roman" w:eastAsia="Times New Roman" w:hAnsi="Times New Roman"/>
+                <w:b w:val="false"/>
+                <w:bCs w:val="false"/>
+                <w:sz w:val="26"/>
+                <w:szCs w:val="26"/>
               </w:rPr>
               <w:t xml:space="preserve">126.22</w:t>
             </w:r>
@@ -1125,11 +1125,11 @@
             </w:pPr>
             <w:r>
               <w:rPr>
-                <w:rFonts w:ascii="Calibri" w:cs="Calibri" w:eastAsia="Calibri" w:hAnsi="Calibri"/>
-                <w:b w:val="false"/>
-                <w:bCs w:val="false"/>
-                <w:sz w:val="21"/>
-                <w:szCs w:val="21"/>
+                <w:rFonts w:ascii="Times New Roman" w:cs="Times New Roman" w:eastAsia="Times New Roman" w:hAnsi="Times New Roman"/>
+                <w:b w:val="false"/>
+                <w:bCs w:val="false"/>
+                <w:sz w:val="26"/>
+                <w:szCs w:val="26"/>
               </w:rPr>
               <w:t xml:space="preserve">81.91</w:t>
             </w:r>
@@ -1154,11 +1154,11 @@
             </w:pPr>
             <w:r>
               <w:rPr>
-                <w:rFonts w:ascii="Calibri" w:cs="Calibri" w:eastAsia="Calibri" w:hAnsi="Calibri"/>
-                <w:b w:val="false"/>
-                <w:bCs w:val="false"/>
-                <w:sz w:val="21"/>
-                <w:szCs w:val="21"/>
+                <w:rFonts w:ascii="Times New Roman" w:cs="Times New Roman" w:eastAsia="Times New Roman" w:hAnsi="Times New Roman"/>
+                <w:b w:val="false"/>
+                <w:bCs w:val="false"/>
+                <w:sz w:val="26"/>
+                <w:szCs w:val="26"/>
               </w:rPr>
               <w:t xml:space="preserve">7</w:t>
             </w:r>
@@ -1181,11 +1181,11 @@
             </w:pPr>
             <w:r>
               <w:rPr>
-                <w:rFonts w:ascii="Calibri" w:cs="Calibri" w:eastAsia="Calibri" w:hAnsi="Calibri"/>
-                <w:b w:val="false"/>
-                <w:bCs w:val="false"/>
-                <w:sz w:val="21"/>
-                <w:szCs w:val="21"/>
+                <w:rFonts w:ascii="Times New Roman" w:cs="Times New Roman" w:eastAsia="Times New Roman" w:hAnsi="Times New Roman"/>
+                <w:b w:val="false"/>
+                <w:bCs w:val="false"/>
+                <w:sz w:val="26"/>
+                <w:szCs w:val="26"/>
               </w:rPr>
               <w:t xml:space="preserve">95.16</w:t>
             </w:r>
@@ -1208,11 +1208,11 @@
             </w:pPr>
             <w:r>
               <w:rPr>
-                <w:rFonts w:ascii="Calibri" w:cs="Calibri" w:eastAsia="Calibri" w:hAnsi="Calibri"/>
-                <w:b w:val="false"/>
-                <w:bCs w:val="false"/>
-                <w:sz w:val="21"/>
-                <w:szCs w:val="21"/>
+                <w:rFonts w:ascii="Times New Roman" w:cs="Times New Roman" w:eastAsia="Times New Roman" w:hAnsi="Times New Roman"/>
+                <w:b w:val="false"/>
+                <w:bCs w:val="false"/>
+                <w:sz w:val="26"/>
+                <w:szCs w:val="26"/>
               </w:rPr>
               <w:t xml:space="preserve">139.41</w:t>
             </w:r>
@@ -1235,11 +1235,11 @@
             </w:pPr>
             <w:r>
               <w:rPr>
-                <w:rFonts w:ascii="Calibri" w:cs="Calibri" w:eastAsia="Calibri" w:hAnsi="Calibri"/>
-                <w:b w:val="false"/>
-                <w:bCs w:val="false"/>
-                <w:sz w:val="21"/>
-                <w:szCs w:val="21"/>
+                <w:rFonts w:ascii="Times New Roman" w:cs="Times New Roman" w:eastAsia="Times New Roman" w:hAnsi="Times New Roman"/>
+                <w:b w:val="false"/>
+                <w:bCs w:val="false"/>
+                <w:sz w:val="26"/>
+                <w:szCs w:val="26"/>
               </w:rPr>
               <w:t xml:space="preserve">125.28</w:t>
             </w:r>
@@ -1262,11 +1262,11 @@
             </w:pPr>
             <w:r>
               <w:rPr>
-                <w:rFonts w:ascii="Calibri" w:cs="Calibri" w:eastAsia="Calibri" w:hAnsi="Calibri"/>
-                <w:b w:val="false"/>
-                <w:bCs w:val="false"/>
-                <w:sz w:val="21"/>
-                <w:szCs w:val="21"/>
+                <w:rFonts w:ascii="Times New Roman" w:cs="Times New Roman" w:eastAsia="Times New Roman" w:hAnsi="Times New Roman"/>
+                <w:b w:val="false"/>
+                <w:bCs w:val="false"/>
+                <w:sz w:val="26"/>
+                <w:szCs w:val="26"/>
               </w:rPr>
               <w:t xml:space="preserve">89.23</w:t>
             </w:r>
@@ -1291,11 +1291,11 @@
             </w:pPr>
             <w:r>
               <w:rPr>
-                <w:rFonts w:ascii="Calibri" w:cs="Calibri" w:eastAsia="Calibri" w:hAnsi="Calibri"/>
-                <w:b w:val="false"/>
-                <w:bCs w:val="false"/>
-                <w:sz w:val="21"/>
-                <w:szCs w:val="21"/>
+                <w:rFonts w:ascii="Times New Roman" w:cs="Times New Roman" w:eastAsia="Times New Roman" w:hAnsi="Times New Roman"/>
+                <w:b w:val="false"/>
+                <w:bCs w:val="false"/>
+                <w:sz w:val="26"/>
+                <w:szCs w:val="26"/>
               </w:rPr>
               <w:t xml:space="preserve">8</w:t>
             </w:r>
@@ -1318,11 +1318,11 @@
             </w:pPr>
             <w:r>
               <w:rPr>
-                <w:rFonts w:ascii="Calibri" w:cs="Calibri" w:eastAsia="Calibri" w:hAnsi="Calibri"/>
-                <w:b w:val="false"/>
-                <w:bCs w:val="false"/>
-                <w:sz w:val="21"/>
-                <w:szCs w:val="21"/>
+                <w:rFonts w:ascii="Times New Roman" w:cs="Times New Roman" w:eastAsia="Times New Roman" w:hAnsi="Times New Roman"/>
+                <w:b w:val="false"/>
+                <w:bCs w:val="false"/>
+                <w:sz w:val="26"/>
+                <w:szCs w:val="26"/>
               </w:rPr>
               <w:t xml:space="preserve">104.41</w:t>
             </w:r>
@@ -1345,11 +1345,11 @@
             </w:pPr>
             <w:r>
               <w:rPr>
-                <w:rFonts w:ascii="Calibri" w:cs="Calibri" w:eastAsia="Calibri" w:hAnsi="Calibri"/>
-                <w:b w:val="false"/>
-                <w:bCs w:val="false"/>
-                <w:sz w:val="21"/>
-                <w:szCs w:val="21"/>
+                <w:rFonts w:ascii="Times New Roman" w:cs="Times New Roman" w:eastAsia="Times New Roman" w:hAnsi="Times New Roman"/>
+                <w:b w:val="false"/>
+                <w:bCs w:val="false"/>
+                <w:sz w:val="26"/>
+                <w:szCs w:val="26"/>
               </w:rPr>
               <w:t xml:space="preserve">158.27</w:t>
             </w:r>
@@ -1372,11 +1372,11 @@
             </w:pPr>
             <w:r>
               <w:rPr>
-                <w:rFonts w:ascii="Calibri" w:cs="Calibri" w:eastAsia="Calibri" w:hAnsi="Calibri"/>
-                <w:b w:val="false"/>
-                <w:bCs w:val="false"/>
-                <w:sz w:val="21"/>
-                <w:szCs w:val="21"/>
+                <w:rFonts w:ascii="Times New Roman" w:cs="Times New Roman" w:eastAsia="Times New Roman" w:hAnsi="Times New Roman"/>
+                <w:b w:val="false"/>
+                <w:bCs w:val="false"/>
+                <w:sz w:val="26"/>
+                <w:szCs w:val="26"/>
               </w:rPr>
               <w:t xml:space="preserve">136.70</w:t>
             </w:r>
@@ -1399,11 +1399,11 @@
             </w:pPr>
             <w:r>
               <w:rPr>
-                <w:rFonts w:ascii="Calibri" w:cs="Calibri" w:eastAsia="Calibri" w:hAnsi="Calibri"/>
-                <w:b w:val="false"/>
-                <w:bCs w:val="false"/>
-                <w:sz w:val="21"/>
-                <w:szCs w:val="21"/>
+                <w:rFonts w:ascii="Times New Roman" w:cs="Times New Roman" w:eastAsia="Times New Roman" w:hAnsi="Times New Roman"/>
+                <w:b w:val="false"/>
+                <w:bCs w:val="false"/>
+                <w:sz w:val="26"/>
+                <w:szCs w:val="26"/>
               </w:rPr>
               <w:t xml:space="preserve">101.92</w:t>
             </w:r>
@@ -1428,11 +1428,11 @@
             </w:pPr>
             <w:r>
               <w:rPr>
-                <w:rFonts w:ascii="Calibri" w:cs="Calibri" w:eastAsia="Calibri" w:hAnsi="Calibri"/>
-                <w:b w:val="false"/>
-                <w:bCs w:val="false"/>
-                <w:sz w:val="21"/>
-                <w:szCs w:val="21"/>
+                <w:rFonts w:ascii="Times New Roman" w:cs="Times New Roman" w:eastAsia="Times New Roman" w:hAnsi="Times New Roman"/>
+                <w:b w:val="false"/>
+                <w:bCs w:val="false"/>
+                <w:sz w:val="26"/>
+                <w:szCs w:val="26"/>
               </w:rPr>
               <w:t xml:space="preserve">9</w:t>
             </w:r>
@@ -1455,11 +1455,11 @@
             </w:pPr>
             <w:r>
               <w:rPr>
-                <w:rFonts w:ascii="Calibri" w:cs="Calibri" w:eastAsia="Calibri" w:hAnsi="Calibri"/>
-                <w:b w:val="false"/>
-                <w:bCs w:val="false"/>
-                <w:sz w:val="21"/>
-                <w:szCs w:val="21"/>
+                <w:rFonts w:ascii="Times New Roman" w:cs="Times New Roman" w:eastAsia="Times New Roman" w:hAnsi="Times New Roman"/>
+                <w:b w:val="false"/>
+                <w:bCs w:val="false"/>
+                <w:sz w:val="26"/>
+                <w:szCs w:val="26"/>
               </w:rPr>
               <w:t xml:space="preserve">94.51</w:t>
             </w:r>
@@ -1482,11 +1482,11 @@
             </w:pPr>
             <w:r>
               <w:rPr>
-                <w:rFonts w:ascii="Calibri" w:cs="Calibri" w:eastAsia="Calibri" w:hAnsi="Calibri"/>
-                <w:b w:val="false"/>
-                <w:bCs w:val="false"/>
-                <w:sz w:val="21"/>
-                <w:szCs w:val="21"/>
+                <w:rFonts w:ascii="Times New Roman" w:cs="Times New Roman" w:eastAsia="Times New Roman" w:hAnsi="Times New Roman"/>
+                <w:b w:val="false"/>
+                <w:bCs w:val="false"/>
+                <w:sz w:val="26"/>
+                <w:szCs w:val="26"/>
               </w:rPr>
               <w:t xml:space="preserve">199.09</w:t>
             </w:r>
@@ -1509,11 +1509,11 @@
             </w:pPr>
             <w:r>
               <w:rPr>
-                <w:rFonts w:ascii="Calibri" w:cs="Calibri" w:eastAsia="Calibri" w:hAnsi="Calibri"/>
-                <w:b w:val="false"/>
-                <w:bCs w:val="false"/>
-                <w:sz w:val="21"/>
-                <w:szCs w:val="21"/>
+                <w:rFonts w:ascii="Times New Roman" w:cs="Times New Roman" w:eastAsia="Times New Roman" w:hAnsi="Times New Roman"/>
+                <w:b w:val="false"/>
+                <w:bCs w:val="false"/>
+                <w:sz w:val="26"/>
+                <w:szCs w:val="26"/>
               </w:rPr>
               <w:t xml:space="preserve">152.10</w:t>
             </w:r>
@@ -1536,11 +1536,11 @@
             </w:pPr>
             <w:r>
               <w:rPr>
-                <w:rFonts w:ascii="Calibri" w:cs="Calibri" w:eastAsia="Calibri" w:hAnsi="Calibri"/>
-                <w:b w:val="false"/>
-                <w:bCs w:val="false"/>
-                <w:sz w:val="21"/>
-                <w:szCs w:val="21"/>
+                <w:rFonts w:ascii="Times New Roman" w:cs="Times New Roman" w:eastAsia="Times New Roman" w:hAnsi="Times New Roman"/>
+                <w:b w:val="false"/>
+                <w:bCs w:val="false"/>
+                <w:sz w:val="26"/>
+                <w:szCs w:val="26"/>
               </w:rPr>
               <w:t xml:space="preserve">86.62</w:t>
             </w:r>
@@ -1565,11 +1565,11 @@
             </w:pPr>
             <w:r>
               <w:rPr>
-                <w:rFonts w:ascii="Calibri" w:cs="Calibri" w:eastAsia="Calibri" w:hAnsi="Calibri"/>
-                <w:b w:val="false"/>
-                <w:bCs w:val="false"/>
-                <w:sz w:val="21"/>
-                <w:szCs w:val="21"/>
+                <w:rFonts w:ascii="Times New Roman" w:cs="Times New Roman" w:eastAsia="Times New Roman" w:hAnsi="Times New Roman"/>
+                <w:b w:val="false"/>
+                <w:bCs w:val="false"/>
+                <w:sz w:val="26"/>
+                <w:szCs w:val="26"/>
               </w:rPr>
               <w:t xml:space="preserve">10</w:t>
             </w:r>
@@ -1592,11 +1592,11 @@
             </w:pPr>
             <w:r>
               <w:rPr>
-                <w:rFonts w:ascii="Calibri" w:cs="Calibri" w:eastAsia="Calibri" w:hAnsi="Calibri"/>
-                <w:b w:val="false"/>
-                <w:bCs w:val="false"/>
-                <w:sz w:val="21"/>
-                <w:szCs w:val="21"/>
+                <w:rFonts w:ascii="Times New Roman" w:cs="Times New Roman" w:eastAsia="Times New Roman" w:hAnsi="Times New Roman"/>
+                <w:b w:val="false"/>
+                <w:bCs w:val="false"/>
+                <w:sz w:val="26"/>
+                <w:szCs w:val="26"/>
               </w:rPr>
               <w:t xml:space="preserve">106.50</w:t>
             </w:r>
@@ -1619,11 +1619,11 @@
             </w:pPr>
             <w:r>
               <w:rPr>
-                <w:rFonts w:ascii="Calibri" w:cs="Calibri" w:eastAsia="Calibri" w:hAnsi="Calibri"/>
-                <w:b w:val="false"/>
-                <w:bCs w:val="false"/>
-                <w:sz w:val="21"/>
-                <w:szCs w:val="21"/>
+                <w:rFonts w:ascii="Times New Roman" w:cs="Times New Roman" w:eastAsia="Times New Roman" w:hAnsi="Times New Roman"/>
+                <w:b w:val="false"/>
+                <w:bCs w:val="false"/>
+                <w:sz w:val="26"/>
+                <w:szCs w:val="26"/>
               </w:rPr>
               <w:t xml:space="preserve">151.81</w:t>
             </w:r>
@@ -1646,11 +1646,11 @@
             </w:pPr>
             <w:r>
               <w:rPr>
-                <w:rFonts w:ascii="Calibri" w:cs="Calibri" w:eastAsia="Calibri" w:hAnsi="Calibri"/>
-                <w:b w:val="false"/>
-                <w:bCs w:val="false"/>
-                <w:sz w:val="21"/>
-                <w:szCs w:val="21"/>
+                <w:rFonts w:ascii="Times New Roman" w:cs="Times New Roman" w:eastAsia="Times New Roman" w:hAnsi="Times New Roman"/>
+                <w:b w:val="false"/>
+                <w:bCs w:val="false"/>
+                <w:sz w:val="26"/>
+                <w:szCs w:val="26"/>
               </w:rPr>
               <w:t xml:space="preserve">139.13</w:t>
             </w:r>
@@ -1673,11 +1673,11 @@
             </w:pPr>
             <w:r>
               <w:rPr>
-                <w:rFonts w:ascii="Calibri" w:cs="Calibri" w:eastAsia="Calibri" w:hAnsi="Calibri"/>
-                <w:b w:val="false"/>
-                <w:bCs w:val="false"/>
-                <w:sz w:val="21"/>
-                <w:szCs w:val="21"/>
+                <w:rFonts w:ascii="Times New Roman" w:cs="Times New Roman" w:eastAsia="Times New Roman" w:hAnsi="Times New Roman"/>
+                <w:b w:val="false"/>
+                <w:bCs w:val="false"/>
+                <w:sz w:val="26"/>
+                <w:szCs w:val="26"/>
               </w:rPr>
               <w:t xml:space="preserve">85.36</w:t>
             </w:r>
@@ -1703,11 +1703,11 @@
             </w:pPr>
             <w:r>
               <w:rPr>
-                <w:rFonts w:ascii="Calibri" w:cs="Calibri" w:eastAsia="Calibri" w:hAnsi="Calibri"/>
+                <w:rFonts w:ascii="Times New Roman" w:cs="Times New Roman" w:eastAsia="Times New Roman" w:hAnsi="Times New Roman"/>
                 <w:b/>
                 <w:bCs/>
-                <w:sz w:val="21"/>
-                <w:szCs w:val="21"/>
+                <w:sz w:val="26"/>
+                <w:szCs w:val="26"/>
               </w:rPr>
               <w:t xml:space="preserve">Trung bình</w:t>
             </w:r>
@@ -1731,11 +1731,11 @@
             </w:pPr>
             <w:r>
               <w:rPr>
-                <w:rFonts w:ascii="Calibri" w:cs="Calibri" w:eastAsia="Calibri" w:hAnsi="Calibri"/>
+                <w:rFonts w:ascii="Times New Roman" w:cs="Times New Roman" w:eastAsia="Times New Roman" w:hAnsi="Times New Roman"/>
                 <w:b/>
                 <w:bCs/>
-                <w:sz w:val="21"/>
-                <w:szCs w:val="21"/>
+                <w:sz w:val="26"/>
+                <w:szCs w:val="26"/>
               </w:rPr>
               <w:t xml:space="preserve">90.54</w:t>
             </w:r>
@@ -1759,11 +1759,11 @@
             </w:pPr>
             <w:r>
               <w:rPr>
-                <w:rFonts w:ascii="Calibri" w:cs="Calibri" w:eastAsia="Calibri" w:hAnsi="Calibri"/>
+                <w:rFonts w:ascii="Times New Roman" w:cs="Times New Roman" w:eastAsia="Times New Roman" w:hAnsi="Times New Roman"/>
                 <w:b/>
                 <w:bCs/>
-                <w:sz w:val="21"/>
-                <w:szCs w:val="21"/>
+                <w:sz w:val="26"/>
+                <w:szCs w:val="26"/>
               </w:rPr>
               <w:t xml:space="preserve">139.49</w:t>
             </w:r>
@@ -1787,11 +1787,11 @@
             </w:pPr>
             <w:r>
               <w:rPr>
-                <w:rFonts w:ascii="Calibri" w:cs="Calibri" w:eastAsia="Calibri" w:hAnsi="Calibri"/>
+                <w:rFonts w:ascii="Times New Roman" w:cs="Times New Roman" w:eastAsia="Times New Roman" w:hAnsi="Times New Roman"/>
                 <w:b/>
                 <w:bCs/>
-                <w:sz w:val="21"/>
-                <w:szCs w:val="21"/>
+                <w:sz w:val="26"/>
+                <w:szCs w:val="26"/>
               </w:rPr>
               <w:t xml:space="preserve">114.29</w:t>
             </w:r>
@@ -1815,11 +1815,11 @@
             </w:pPr>
             <w:r>
               <w:rPr>
-                <w:rFonts w:ascii="Calibri" w:cs="Calibri" w:eastAsia="Calibri" w:hAnsi="Calibri"/>
+                <w:rFonts w:ascii="Times New Roman" w:cs="Times New Roman" w:eastAsia="Times New Roman" w:hAnsi="Times New Roman"/>
                 <w:b/>
                 <w:bCs/>
-                <w:sz w:val="21"/>
-                <w:szCs w:val="21"/>
+                <w:sz w:val="26"/>
+                <w:szCs w:val="26"/>
               </w:rPr>
               <w:t xml:space="preserve">72.17</w:t>
             </w:r>
@@ -1833,11 +1833,11 @@
       </w:pPr>
       <w:r>
         <w:rPr>
-          <w:rFonts w:ascii="Calibri" w:cs="Calibri" w:eastAsia="Calibri" w:hAnsi="Calibri"/>
+          <w:rFonts w:ascii="Times New Roman" w:cs="Times New Roman" w:eastAsia="Times New Roman" w:hAnsi="Times New Roman"/>
           <w:i/>
           <w:iCs/>
-          <w:sz w:val="18"/>
-          <w:szCs w:val="18"/>
+          <w:sz w:val="20"/>
+          <w:szCs w:val="20"/>
         </w:rPr>
         <w:t xml:space="preserve">Môi trường thử nghiệm: biên dịch g++ -O2 -std=c++17; mỗi dãy ~1.000.000 số thực (kiểu double); dữ liệu sinh ngẫu nhiên với seed cố định = 2026 để đảm bảo khả năng tái lập.</w:t>
       </w:r>
@@ -1848,13 +1848,13 @@
       </w:pPr>
       <w:r>
         <w:rPr>
-          <w:rFonts w:ascii="Calibri" w:cs="Calibri" w:eastAsia="Calibri" w:hAnsi="Calibri"/>
+          <w:rFonts w:ascii="Times New Roman" w:cs="Times New Roman" w:eastAsia="Times New Roman" w:hAnsi="Times New Roman"/>
           <w:b/>
           <w:bCs/>
           <w:i/>
           <w:iCs/>
-          <w:sz w:val="23"/>
-          <w:szCs w:val="23"/>
+          <w:sz w:val="26"/>
+          <w:szCs w:val="26"/>
         </w:rPr>
         <w:t xml:space="preserve">2. Biểu đồ (cột) thời gian thực hiện</w:t>
       </w:r>
@@ -1916,13 +1916,26 @@
       </w:pPr>
       <w:r>
         <w:rPr>
-          <w:rFonts w:ascii="Calibri" w:cs="Calibri" w:eastAsia="Calibri" w:hAnsi="Calibri"/>
+          <w:rFonts w:ascii="Times New Roman" w:cs="Times New Roman" w:eastAsia="Times New Roman" w:hAnsi="Times New Roman"/>
           <w:b/>
           <w:bCs/>
+          <w:sz w:val="28"/>
+          <w:szCs w:val="28"/>
+        </w:rPr>
+        <w:t xml:space="preserve">II. Kết luận</w:t>
+      </w:r>
+    </w:p>
+    <w:p>
+      <w:pPr>
+        <w:spacing w:after="120"/>
+      </w:pPr>
+      <w:r>
+        <w:rPr>
+          <w:rFonts w:ascii="Times New Roman" w:cs="Times New Roman" w:eastAsia="Times New Roman" w:hAnsi="Times New Roman"/>
           <w:sz w:val="26"/>
           <w:szCs w:val="26"/>
         </w:rPr>
-        <w:t xml:space="preserve">II. Kết luận</w:t>
+        <w:t xml:space="preserve">Từ bảng số liệu và biểu đồ thực nghiệm trên 10 bộ dữ liệu (mỗi bộ ~1.000.000 số thực), có thể rút ra một số nhận xét sau:</w:t>
       </w:r>
     </w:p>
     <w:p>
@@ -1931,11 +1944,11 @@
       </w:pPr>
       <w:r>
         <w:rPr>
-          <w:rFonts w:ascii="Calibri" w:cs="Calibri" w:eastAsia="Calibri" w:hAnsi="Calibri"/>
-          <w:sz w:val="22"/>
-          <w:szCs w:val="22"/>
-        </w:rPr>
-        <w:t xml:space="preserve">Từ bảng số liệu và biểu đồ thực nghiệm trên 10 bộ dữ liệu (mỗi bộ ~1.000.000 số thực), có thể rút ra một số nhận xét sau:</w:t>
+          <w:rFonts w:ascii="Times New Roman" w:cs="Times New Roman" w:eastAsia="Times New Roman" w:hAnsi="Times New Roman"/>
+          <w:sz w:val="26"/>
+          <w:szCs w:val="26"/>
+        </w:rPr>
+        <w:t xml:space="preserve">• std::sort (C++) cho thời gian thực thi trung bình thấp nhất (~72 ms) trong cả 10 bộ dữ liệu, kể cả với dữ liệu đã có thứ tự (tăng/giảm dần) lẫn dữ liệu ngẫu nhiên. Điều này phù hợp với lý thuyết vì std::sort trong thư viện chuẩn C++ cài đặt thuật toán Introsort — kết hợp QuickSort, HeapSort và Insertion Sort, cùng nhiều tối ưu hóa ở mức mã máy (cache locality, loop unrolling, tránh đệ quy sâu...) mà một cài đặt thủ công khó đạt được.</w:t>
       </w:r>
     </w:p>
     <w:p>
@@ -1944,11 +1957,11 @@
       </w:pPr>
       <w:r>
         <w:rPr>
-          <w:rFonts w:ascii="Calibri" w:cs="Calibri" w:eastAsia="Calibri" w:hAnsi="Calibri"/>
-          <w:sz w:val="22"/>
-          <w:szCs w:val="22"/>
-        </w:rPr>
-        <w:t xml:space="preserve">• std::sort (C++) cho thời gian thực thi trung bình thấp nhất (~72 ms) trong cả 10 bộ dữ liệu, kể cả với dữ liệu đã có thứ tự (tăng/giảm dần) lẫn dữ liệu ngẫu nhiên. Điều này phù hợp với lý thuyết vì std::sort trong thư viện chuẩn C++ cài đặt thuật toán Introsort — kết hợp QuickSort, HeapSort và Insertion Sort, cùng nhiều tối ưu hóa ở mức mã máy (cache locality, loop unrolling, tránh đệ quy sâu...) mà một cài đặt thủ công khó đạt được.</w:t>
+          <w:rFonts w:ascii="Times New Roman" w:cs="Times New Roman" w:eastAsia="Times New Roman" w:hAnsi="Times New Roman"/>
+          <w:sz w:val="26"/>
+          <w:szCs w:val="26"/>
+        </w:rPr>
+        <w:t xml:space="preserve">• QuickSort (tự cài đặt, chọn pivot ngẫu nhiên) có thời gian thực thi trung bình đứng thứ 2 (~90 ms), nhanh hơn rõ rệt trên dữ liệu đã có thứ tự (bộ 1, 2: ~36–42 ms) so với dữ liệu ngẫu nhiên (~95–119 ms). Nhờ chọn pivot ngẫu nhiên, thuật toán tránh được trường hợp xấu nhất O(n²) thường gặp khi dùng pivot cố định trên dữ liệu đã sắp xếp.</w:t>
       </w:r>
     </w:p>
     <w:p>
@@ -1957,11 +1970,11 @@
       </w:pPr>
       <w:r>
         <w:rPr>
-          <w:rFonts w:ascii="Calibri" w:cs="Calibri" w:eastAsia="Calibri" w:hAnsi="Calibri"/>
-          <w:sz w:val="22"/>
-          <w:szCs w:val="22"/>
-        </w:rPr>
-        <w:t xml:space="preserve">• QuickSort (tự cài đặt, chọn pivot ngẫu nhiên) có thời gian thực thi trung bình đứng thứ 2 (~90 ms), nhanh hơn rõ rệt trên dữ liệu đã có thứ tự (bộ 1, 2: ~36–42 ms) so với dữ liệu ngẫu nhiên (~95–119 ms). Nhờ chọn pivot ngẫu nhiên, thuật toán tránh được trường hợp xấu nhất O(n²) thường gặp khi dùng pivot cố định trên dữ liệu đã sắp xếp.</w:t>
+          <w:rFonts w:ascii="Times New Roman" w:cs="Times New Roman" w:eastAsia="Times New Roman" w:hAnsi="Times New Roman"/>
+          <w:sz w:val="26"/>
+          <w:szCs w:val="26"/>
+        </w:rPr>
+        <w:t xml:space="preserve">• MergeSort có thời gian ổn định hơn giữa các bộ dữ liệu (dao động ít), do độ phức tạp luôn là O(n log n) bất kể thứ tự đầu vào, nhưng tốn thêm bộ nhớ phụ O(n) cho việc trộn (merge), nên nhìn chung chậm hơn QuickSort trên dữ liệu ngẫu nhiên.</w:t>
       </w:r>
     </w:p>
     <w:p>
@@ -1970,11 +1983,11 @@
       </w:pPr>
       <w:r>
         <w:rPr>
-          <w:rFonts w:ascii="Calibri" w:cs="Calibri" w:eastAsia="Calibri" w:hAnsi="Calibri"/>
-          <w:sz w:val="22"/>
-          <w:szCs w:val="22"/>
-        </w:rPr>
-        <w:t xml:space="preserve">• MergeSort có thời gian ổn định hơn giữa các bộ dữ liệu (dao động ít), do độ phức tạp luôn là O(n log n) bất kể thứ tự đầu vào, nhưng tốn thêm bộ nhớ phụ O(n) cho việc trộn (merge), nên nhìn chung chậm hơn QuickSort trên dữ liệu ngẫu nhiên.</w:t>
+          <w:rFonts w:ascii="Times New Roman" w:cs="Times New Roman" w:eastAsia="Times New Roman" w:hAnsi="Times New Roman"/>
+          <w:sz w:val="26"/>
+          <w:szCs w:val="26"/>
+        </w:rPr>
+        <w:t xml:space="preserve">• HeapSort có thời gian thực thi trung bình cao nhất (~139 ms) dù độ phức tạp lý thuyết cũng là O(n log n). Nguyên nhân chủ yếu là do heap truy cập bộ nhớ không liên tục (non-sequential memory access khi sift-down giữa các mức của cây nhị phân), gây nhiều cache-miss hơn so với MergeSort và QuickSort vốn duyệt mảng tuần tự hơn.</w:t>
       </w:r>
     </w:p>
     <w:p>
@@ -1983,11 +1996,11 @@
       </w:pPr>
       <w:r>
         <w:rPr>
-          <w:rFonts w:ascii="Calibri" w:cs="Calibri" w:eastAsia="Calibri" w:hAnsi="Calibri"/>
-          <w:sz w:val="22"/>
-          <w:szCs w:val="22"/>
-        </w:rPr>
-        <w:t xml:space="preserve">• HeapSort có thời gian thực thi trung bình cao nhất (~139 ms) dù độ phức tạp lý thuyết cũng là O(n log n). Nguyên nhân chủ yếu là do heap truy cập bộ nhớ không liên tục (non-sequential memory access khi sift-down giữa các mức của cây nhị phân), gây nhiều cache-miss hơn so với MergeSort và QuickSort vốn duyệt mảng tuần tự hơn.</w:t>
+          <w:rFonts w:ascii="Times New Roman" w:cs="Times New Roman" w:eastAsia="Times New Roman" w:hAnsi="Times New Roman"/>
+          <w:sz w:val="26"/>
+          <w:szCs w:val="26"/>
+        </w:rPr>
+        <w:t xml:space="preserve">• Với 2 bộ dữ liệu đã có thứ tự sẵn (bộ 1 tăng dần, bộ 2 giảm dần), tất cả 4 thuật toán đều chạy nhanh hơn đáng kể so với 8 bộ dữ liệu ngẫu nhiên còn lại, đặc biệt là std::sort và MergeSort giảm hơn 4–6 lần thời gian thực thi.</w:t>
       </w:r>
     </w:p>
     <w:p>
@@ -1996,22 +2009,9 @@
       </w:pPr>
       <w:r>
         <w:rPr>
-          <w:rFonts w:ascii="Calibri" w:cs="Calibri" w:eastAsia="Calibri" w:hAnsi="Calibri"/>
-          <w:sz w:val="22"/>
-          <w:szCs w:val="22"/>
-        </w:rPr>
-        <w:t xml:space="preserve">• Với 2 bộ dữ liệu đã có thứ tự sẵn (bộ 1 tăng dần, bộ 2 giảm dần), tất cả 4 thuật toán đều chạy nhanh hơn đáng kể so với 8 bộ dữ liệu ngẫu nhiên còn lại, đặc biệt là std::sort và MergeSort giảm hơn 4–6 lần thời gian thực thi.</w:t>
-      </w:r>
-    </w:p>
-    <w:p>
-      <w:pPr>
-        <w:spacing w:after="120"/>
-      </w:pPr>
-      <w:r>
-        <w:rPr>
-          <w:rFonts w:ascii="Calibri" w:cs="Calibri" w:eastAsia="Calibri" w:hAnsi="Calibri"/>
-          <w:sz w:val="22"/>
-          <w:szCs w:val="22"/>
+          <w:rFonts w:ascii="Times New Roman" w:cs="Times New Roman" w:eastAsia="Times New Roman" w:hAnsi="Times New Roman"/>
+          <w:sz w:val="26"/>
+          <w:szCs w:val="26"/>
         </w:rPr>
         <w:t xml:space="preserve">Tóm lại, kết quả thực nghiệm phù hợp với độ phức tạp lý thuyết O(n log n) của cả 4 thuật toán, đồng thời cho thấy rõ ảnh hưởng của yếu tố cài đặt thực tế (cache locality, hằng số ẩn trong O-lớn) đến hiệu năng thực thi, chứ không chỉ phụ thuộc vào độ phức tạp tiệm cận.</w:t>
       </w:r>
@@ -2023,25 +2023,25 @@
       </w:pPr>
       <w:r>
         <w:rPr>
-          <w:rFonts w:ascii="Calibri" w:cs="Calibri" w:eastAsia="Calibri" w:hAnsi="Calibri"/>
+          <w:rFonts w:ascii="Times New Roman" w:cs="Times New Roman" w:eastAsia="Times New Roman" w:hAnsi="Times New Roman"/>
           <w:b/>
           <w:bCs/>
+          <w:sz w:val="28"/>
+          <w:szCs w:val="28"/>
+        </w:rPr>
+        <w:t xml:space="preserve">III. Thông tin chi tiết – link GitHub</w:t>
+      </w:r>
+    </w:p>
+    <w:p>
+      <w:pPr>
+        <w:spacing w:after="120"/>
+      </w:pPr>
+      <w:r>
+        <w:rPr>
+          <w:rFonts w:ascii="Times New Roman" w:cs="Times New Roman" w:eastAsia="Times New Roman" w:hAnsi="Times New Roman"/>
           <w:sz w:val="26"/>
           <w:szCs w:val="26"/>
         </w:rPr>
-        <w:t xml:space="preserve">III. Thông tin chi tiết – link GitHub</w:t>
-      </w:r>
-    </w:p>
-    <w:p>
-      <w:pPr>
-        <w:spacing w:after="120"/>
-      </w:pPr>
-      <w:r>
-        <w:rPr>
-          <w:rFonts w:ascii="Calibri" w:cs="Calibri" w:eastAsia="Calibri" w:hAnsi="Calibri"/>
-          <w:sz w:val="22"/>
-          <w:szCs w:val="22"/>
-        </w:rPr>
         <w:t xml:space="preserve">Toàn bộ mã nguồn, dữ liệu thử nghiệm và báo cáo được lưu trữ công khai (public) tại:</w:t>
       </w:r>
     </w:p>
@@ -2051,12 +2051,12 @@
       </w:pPr>
       <w:r>
         <w:rPr>
-          <w:rFonts w:ascii="Calibri" w:cs="Calibri" w:eastAsia="Calibri" w:hAnsi="Calibri"/>
+          <w:rFonts w:ascii="Times New Roman" w:cs="Times New Roman" w:eastAsia="Times New Roman" w:hAnsi="Times New Roman"/>
           <w:b/>
           <w:bCs/>
           <w:color w:val="2a78d6"/>
-          <w:sz w:val="22"/>
-          <w:szCs w:val="22"/>
+          <w:sz w:val="26"/>
+          <w:szCs w:val="26"/>
           <w:u w:val="single"/>
         </w:rPr>
         <w:t xml:space="preserve">https://github.com/xuanmailehoang227-alt/sorting-benchmark</w:t>
@@ -2068,11 +2068,11 @@
       </w:pPr>
       <w:r>
         <w:rPr>
-          <w:rFonts w:ascii="Calibri" w:cs="Calibri" w:eastAsia="Calibri" w:hAnsi="Calibri"/>
+          <w:rFonts w:ascii="Times New Roman" w:cs="Times New Roman" w:eastAsia="Times New Roman" w:hAnsi="Times New Roman"/>
           <w:b w:val="false"/>
           <w:bCs w:val="false"/>
-          <w:sz w:val="22"/>
-          <w:szCs w:val="22"/>
+          <w:sz w:val="26"/>
+          <w:szCs w:val="26"/>
         </w:rPr>
         <w:t xml:space="preserve">Repository bao gồm:</w:t>
       </w:r>
@@ -2083,9 +2083,9 @@
       </w:pPr>
       <w:r>
         <w:rPr>
-          <w:rFonts w:ascii="Calibri" w:cs="Calibri" w:eastAsia="Calibri" w:hAnsi="Calibri"/>
-          <w:sz w:val="22"/>
-          <w:szCs w:val="22"/>
+          <w:rFonts w:ascii="Times New Roman" w:cs="Times New Roman" w:eastAsia="Times New Roman" w:hAnsi="Times New Roman"/>
+          <w:sz w:val="26"/>
+          <w:szCs w:val="26"/>
         </w:rPr>
         <w:t xml:space="preserve">1. Báo cáo (file PDF báo cáo kết quả thử nghiệm này)</w:t>
       </w:r>
@@ -2096,9 +2096,9 @@
       </w:pPr>
       <w:r>
         <w:rPr>
-          <w:rFonts w:ascii="Calibri" w:cs="Calibri" w:eastAsia="Calibri" w:hAnsi="Calibri"/>
-          <w:sz w:val="22"/>
-          <w:szCs w:val="22"/>
+          <w:rFonts w:ascii="Times New Roman" w:cs="Times New Roman" w:eastAsia="Times New Roman" w:hAnsi="Times New Roman"/>
+          <w:sz w:val="26"/>
+          <w:szCs w:val="26"/>
         </w:rPr>
         <w:t xml:space="preserve">2. Mã nguồn (chương trình sinh dữ liệu, cài đặt 4 thuật toán sắp xếp, chương trình đo thời gian thực thi, script vẽ biểu đồ)</w:t>
       </w:r>
@@ -2109,9 +2109,9 @@
       </w:pPr>
       <w:r>
         <w:rPr>
-          <w:rFonts w:ascii="Calibri" w:cs="Calibri" w:eastAsia="Calibri" w:hAnsi="Calibri"/>
-          <w:sz w:val="22"/>
-          <w:szCs w:val="22"/>
+          <w:rFonts w:ascii="Times New Roman" w:cs="Times New Roman" w:eastAsia="Times New Roman" w:hAnsi="Times New Roman"/>
+          <w:sz w:val="26"/>
+          <w:szCs w:val="26"/>
         </w:rPr>
         <w:t xml:space="preserve">3. Dữ liệu thử nghiệm (10 bộ dữ liệu nhị phân đã sinh, và file kết quả CSV)</w:t>
       </w:r>
@@ -2304,9 +2304,9 @@
   <w:docDefaults>
     <w:rPrDefault>
       <w:rPr>
-        <w:rFonts w:ascii="Calibri" w:cs="Calibri" w:eastAsia="Calibri" w:hAnsi="Calibri"/>
-        <w:sz w:val="22"/>
-        <w:szCs w:val="22"/>
+        <w:rFonts w:ascii="Times New Roman" w:cs="Times New Roman" w:eastAsia="Times New Roman" w:hAnsi="Times New Roman"/>
+        <w:sz w:val="26"/>
+        <w:szCs w:val="26"/>
       </w:rPr>
     </w:rPrDefault>
     <w:pPrDefault/>

</xml_diff>